<commit_message>
Add verified OSPF Packet Tracer lab and interview guidance
</commit_message>
<xml_diff>
--- a/project-01-charity-center/guide.docx
+++ b/project-01-charity-center/guide.docx
@@ -4277,6 +4277,66 @@
         <w:t>Скриншоты сделаны в установленной на этом компьютере версии Cisco Packet Tracer 9.0.0. Итоги сетевых тестов появятся после выполнения лаборатории; их нельзя подменять ожидаемыми результатами из этого руководства.</w:t>
       </w:r>
     </w:p>
+    <w:p>
+      <w:r>
+        <w:br w:type="page"/>
+      </w:r>
+    </w:p>
+    <w:p>
+      <w:pPr>
+        <w:pStyle w:val="Heading1"/>
+      </w:pPr>
+      <w:r>
+        <w:t>Практическое применение и собеседование</w:t>
+      </w:r>
+    </w:p>
+    <w:p>
+      <w:r>
+        <w:t>Представь небольшой благотворительный центр: сотрудники ведут записи, волонтёры пользуются внутренним порталом, гости подключаются к отдельной сети. В такой ситуации VLAN разделяют роли, DHCP выдаёт настройки автоматически, DNS позволяет обращаться к сервису по имени, NAT даёт доступ наружу, а ACL описывает, кому запрещён доступ к внутренним ресурсам. SSH оставляет администрирование только разрешённой группе.</w:t>
+      </w:r>
+    </w:p>
+    <w:p>
+      <w:r>
+        <w:t>Это учебная модель, а не готовая промышленная сеть. В реальной организации потребуются резервные копии конфигурации, журналирование, мониторинг, обновления, продуманная политика паролей и проверка правил с владельцами сервисов.</w:t>
+      </w:r>
+    </w:p>
+    <w:p>
+      <w:pPr>
+        <w:pStyle w:val="Heading1"/>
+      </w:pPr>
+      <w:r>
+        <w:t>Как показать работу за 2 минуты</w:t>
+      </w:r>
+    </w:p>
+    <w:p>
+      <w:pPr>
+        <w:ind w:left="312" w:hanging="227"/>
+      </w:pPr>
+      <w:r>
+        <w:t>1. Начни с задачи: «Нужно разделить пользователей по ролям и дать им только нужный доступ». Покажи на схеме, где находятся администратор, волонтёр, гость, внутренний и внешний сервер.</w:t>
+      </w:r>
+    </w:p>
+    <w:p>
+      <w:pPr>
+        <w:ind w:left="312" w:hanging="227"/>
+      </w:pPr>
+      <w:r>
+        <w:t>2. На S1 покажи `show vlan brief` и `show interfaces trunk`. На R1 — подинтерфейсы 802.1Q, DHCP-пулы, NAT и ACL. Для каждой команды объясни, какой вопрос она проверяет.</w:t>
+      </w:r>
+    </w:p>
+    <w:p>
+      <w:pPr>
+        <w:ind w:left="312" w:hanging="227"/>
+      </w:pPr>
+      <w:r>
+        <w:t>3. Продемонстрируй один разрешённый и один запрещённый путь: волонтёр открывает внутренний портал, гость до него не доходит. Затем покажи доступ гостя к внешнему учебному серверу. Укажи, какое правило ACL сработало.</w:t>
+      </w:r>
+    </w:p>
+    <w:p>
+      <w:r>
+        <w:t>Типичный вопрос: «Почему одного VLAN недостаточно для защиты?» Ответ: VLAN отделяет широковещательный домен, но межсетевой доступ проходит через маршрутизатор; именно там ACL задаёт политику. На вопрос «Как диагностировал бы отсутствие сайта?» отвечай по порядку: адрес и шлюз ПК → VLAN порта → trunk → маршрутизация → DNS → HTTP → ACL. Пока лаборатория не воспроизведена в .pkt, представляй её как проектный план и не выдавай ожидаемые результаты за выполненные тесты.</w:t>
+      </w:r>
+    </w:p>
     <w:sectPr>
       <w:pgSz w:w="11906" w:h="16838"/>
       <w:pgMar w:top="964" w:right="1020" w:bottom="964" w:left="1020" w:header="720" w:footer="720" w:gutter="0"/>

</xml_diff>

<commit_message>
Add built charity network and five Packet Tracer incident labs
</commit_message>
<xml_diff>
--- a/project-01-charity-center/guide.docx
+++ b/project-01-charity-center/guide.docx
@@ -2949,6 +2949,10 @@
         <w:br/>
         <w:t>ip access-list extended GUEST_IN</w:t>
         <w:br/>
+        <w:t xml:space="preserve"> 1 permit udp any eq 68 any eq 67</w:t>
+        <w:br/>
+        <w:t xml:space="preserve"> 5 permit udp 10.10.30.0 0.0.0.255 any eq 67</w:t>
+        <w:br/>
         <w:t xml:space="preserve"> deny ip 10.10.30.0 0.0.0.255 10.10.0.0 0.0.255.255</w:t>
         <w:br/>
         <w:t xml:space="preserve"> permit ip 10.10.30.0 0.0.0.255 any</w:t>
@@ -2973,6 +2977,11 @@
     </w:p>
     <w:p>
       <w:r>
+        <w:t>Первые два правила сохраняют DHCP: начальный Discover идёт с 0.0.0.0:68 на порт 67, а следующие запросы могут исходить уже из гостевой подсети. Если поставить запрет раньше или пропустить Discover, PC Guest получит ошибку DHCP. Проверь `show ip access-lists GUEST_IN` и затем повтори запрос в Desktop → IP Configuration. Это реальный пример диагностики порядка ACL для собеседования.</w:t>
+      </w:r>
+    </w:p>
+    <w:p>
+      <w:r>
         <w:t>Для SSH на R1 создай свой пароль. В публичных материалах замени его на YOUR_PASSWORD. Домен нужен маршрутизатору для генерации ключей RSA.</w:t>
       </w:r>
     </w:p>
@@ -2989,8 +2998,19 @@
         <w:br/>
         <w:t>username netadmin privilege 15 secret YOUR_PASSWORD</w:t>
         <w:br/>
-        <w:t>crypto key generate rsa modulus 1024</w:t>
-        <w:br/>
+        <w:t>crypto key generate rsa</w:t>
+      </w:r>
+    </w:p>
+    <w:p>
+      <w:r>
+        <w:t>Когда появится `How many bits in the modulus [512]:`, введи `1024` и нажми Enter. Дождись сообщения `[OK]`, затем продолжай настройку:</w:t>
+      </w:r>
+    </w:p>
+    <w:p>
+      <w:pPr>
+        <w:pStyle w:val="CodeBlock"/>
+      </w:pPr>
+      <w:r>
         <w:t>ip ssh version 2</w:t>
         <w:br/>
         <w:t>access-list 10 permit 10.10.10.0 0.0.0.255</w:t>
@@ -3012,7 +3032,7 @@
     </w:p>
     <w:p>
       <w:r>
-        <w:t>`login local` проверяет имя и пароль по локальной базе. `transport input ssh` отключает Telnet на VTY. `access-class 10 in` допускает соединение только из сети администраторов. Если Packet Tracer не принимает форму команды генерации ключа, введи `crypto key generate rsa` и ответь на запрос размера ключа: 1024.</w:t>
+        <w:t>`login local` проверяет имя и пароль по локальной базе. `transport input ssh` отключает Telnet на VTY. `access-class 10 in` допускает соединение только из сети администраторов.</w:t>
       </w:r>
     </w:p>
     <w:p>

</xml_diff>

<commit_message>
Align walkthrough filenames with published Packet Tracer labs
</commit_message>
<xml_diff>
--- a/project-01-charity-center/guide.docx
+++ b/project-01-charity-center/guide.docx
@@ -501,7 +501,7 @@
         <w:ind w:left="312" w:hanging="227"/>
       </w:pPr>
       <w:r>
-        <w:t>2. Нажми File → New. Сразу сохрани файл через File → Save As под именем charity-center-network.pkt. Создай на диске отдельную папку network-engineering-labs/01-charity-center.</w:t>
+        <w:t>2. Если строишь сеть с нуля, нажми File → New и сразу сохрани её через File → Save As под именем charity-center-vlan-nat-acl.pkt. Если разбираешь готовую модель из репозитория, сначала скопируй этот .pkt в свою учебную папку и работай с копией: исходник останется эталоном для сравнения.</w:t>
       </w:r>
     </w:p>
     <w:p>
@@ -4354,7 +4354,7 @@
     </w:p>
     <w:p>
       <w:r>
-        <w:t>Типичный вопрос: «Почему одного VLAN недостаточно для защиты?» Ответ: VLAN отделяет широковещательный домен, но межсетевой доступ проходит через маршрутизатор; именно там ACL задаёт политику. На вопрос «Как диагностировал бы отсутствие сайта?» отвечай по порядку: адрес и шлюз ПК → VLAN порта → trunk → маршрутизация → DNS → HTTP → ACL. Пока лаборатория не воспроизведена в .pkt, представляй её как проектный план и не выдавай ожидаемые результаты за выполненные тесты.</w:t>
+        <w:t>Типичный вопрос: «Почему одного VLAN недостаточно для защиты?» Ответ: VLAN отделяет широковещательный домен, но межсетевой доступ проходит через маршрутизатор; именно там ACL задаёт политику. На вопрос «Как диагностировал бы отсутствие сайта?» отвечай по порядку: адрес и шлюз ПК → VLAN порта → trunk → маршрутизация → DNS → HTTP → ACL. В приложенном .pkt проверены DHCP и ICMP-пути, но HTTP, DNS-имена и SSH нужно проверить отдельно перед демонстрацией на собеседовании.</w:t>
       </w:r>
     </w:p>
     <w:sectPr>

</xml_diff>

<commit_message>
Clarify every lab walkthrough and device connection
</commit_message>
<xml_diff>
--- a/project-01-charity-center/guide.docx
+++ b/project-01-charity-center/guide.docx
@@ -1378,6 +1378,7 @@
     <w:p>
       <w:pPr>
         <w:pStyle w:val="Heading1"/>
+        <w:pageBreakBefore/>
       </w:pPr>
       <w:r>
         <w:t>4 Размести устройства и подключи кабели</w:t>
@@ -1393,10 +1394,17 @@
     </w:p>
     <w:p>
       <w:pPr>
+        <w:keepLines/>
         <w:ind w:left="312" w:hanging="227"/>
       </w:pPr>
       <w:r>
-        <w:t>2. Выбери End Devices → PC. Поставь три компьютера, затем два Server. Двойной щелчок по устройству открывает его настройки. Вкладка Config позволяет изменить Display Name, чтобы имена на схеме совпали с этим руководством.</w:t>
+        <w:t>2. Выбери End Devices → PC и размести три PC-PT, затем два Server-PT. До подключения назначь каждому устройству роль: дважды щёлкни по нему, открой Config, в поле Display Name впиши имя из списка ниже и закрой окно крестиком. Исходный номер PC0 или Router0 сам по себе ничего не означает; далее ориентируйся на присвоенное имя.</w:t>
+      </w:r>
+    </w:p>
+    <w:p>
+      <w:pPr/>
+      <w:r>
+        <w:t>Для расположения на твоём скриншоте переименуй так: Router0 → R1 CENTER; Router1 → R2 ISP; Switch0 → S1; Switch1 → S2; Server0 (сверху) → Internal Server; Server1 (справа внизу) → Public Server; PC2 (слева внизу) → PC Admin; PC0 (в центре) → PC Volunteer; PC1 (снизу ближе к центру) → PC Guest. Если расположил значки иначе, можешь выбрать другие исходные PC, но сохрани их роли и соответствующие порты из таблицы.</w:t>
       </w:r>
     </w:p>
     <w:p>
@@ -1404,7 +1412,7 @@
         <w:ind w:left="312" w:hanging="227"/>
       </w:pPr>
       <w:r>
-        <w:t>3. В Connections выбери Copper Straight-Through. Щёлкни по первому устройству, выбери нужный порт, затем щёлкни по второму и выбери его порт. Для каждой пары используй таблицу ниже. Если соединение не поднимается сразу, подожди несколько секунд симуляции.</w:t>
+        <w:t>3. Нажми внизу слева Connections (значок молнии), затем Copper Straight-Through (прямой медный кабель). Щёлкни по первому устройству из строки таблицы, выбери указанный порт в выпадающем списке, щёлкни по второму устройству и выбери его порт. Начни с R1 G0/0 → S1 G0/1, затем выполни остальные семь строк. На PC и Server выбирай FastEthernet0; на коммутаторе Fa0/1 и Fa0/2 — другие порты. Номер справа от косой черты важен: G0/1 и G0/2 не взаимозаменяемы.</w:t>
       </w:r>
     </w:p>
     <w:tbl>
@@ -2298,7 +2306,7 @@
     </w:p>
     <w:p>
       <w:r>
-        <w:t>Проверка: на схеме восемь соединений, и у каждого ты можешь назвать оба порта. В Packet Tracer названия GigabitEthernet часто сокращены до G0/1, а FastEthernet — до Fa0/1.</w:t>
+        <w:t>Проверка: на схеме ровно восемь кабелей, и каждый их конец соответствует таблице. G0/1 — сокращение GigabitEthernet0/1, Fa0/1 — FastEthernet0/1, а Fa0 на PC/Server — FastEthernet0. Красная линия у маршрутизатора на этом этапе возможна: его порт ещё выключен командой shutdown по умолчанию. На этапе настройки интерфейса введёшь no shutdown; оранжевый индикатор коммутатора может временно ожидать STP. Не меняй кабели только из-за цвета до проверки портов и настроек.</w:t>
       </w:r>
     </w:p>
     <w:p>

</xml_diff>